<commit_message>
fix: two-tab layout for TAB2 option rows - fixed col2/sub-tab positions so all option letters and body text align vertically
</commit_message>
<xml_diff>
--- a/output/test_header_center.docx
+++ b/output/test_header_center.docx
@@ -51,9 +51,10 @@
       <w:pPr>
         <w:tabs>
           <w:tab w:val="left" w:pos="2517"/>
+          <w:tab w:val="left" w:pos="2942"/>
         </w:tabs>
         <w:spacing w:before="60" w:after="60"/>
-        <w:ind w:left="2517" w:hanging="2517"/>
+        <w:ind w:left="2942" w:hanging="2942"/>
         <w:rPr>
           <w:sz w:val="24"/>
         </w:rPr>
@@ -79,18 +80,26 @@
       </w:r>
       <w:r>
         <w:rPr>
-          <w:sz w:val="24"/>
-        </w:rPr>
-        <w:t xml:space="preserve"> helps you learn about different countries and their currencies.</w:t>
+          <w:b/>
+          <w:sz w:val="24"/>
+        </w:rPr>
+        <w:tab/>
+      </w:r>
+      <w:r>
+        <w:rPr>
+          <w:sz w:val="24"/>
+        </w:rPr>
+        <w:t>helps you learn about different countries and their currencies.</w:t>
       </w:r>
     </w:p>
     <w:p>
       <w:pPr>
         <w:tabs>
           <w:tab w:val="left" w:pos="2517"/>
+          <w:tab w:val="left" w:pos="2942"/>
         </w:tabs>
         <w:spacing w:before="60" w:after="60"/>
-        <w:ind w:left="2517" w:hanging="2517"/>
+        <w:ind w:left="2942" w:hanging="2942"/>
         <w:rPr>
           <w:sz w:val="24"/>
         </w:rPr>
@@ -116,18 +125,26 @@
       </w:r>
       <w:r>
         <w:rPr>
-          <w:sz w:val="24"/>
-        </w:rPr>
-        <w:t xml:space="preserve"> needs a pattern, a needle and threads.</w:t>
+          <w:b/>
+          <w:sz w:val="24"/>
+        </w:rPr>
+        <w:tab/>
+      </w:r>
+      <w:r>
+        <w:rPr>
+          <w:sz w:val="24"/>
+        </w:rPr>
+        <w:t>needs a pattern, a needle and threads.</w:t>
       </w:r>
     </w:p>
     <w:p>
       <w:pPr>
         <w:tabs>
           <w:tab w:val="left" w:pos="2109"/>
+          <w:tab w:val="left" w:pos="2534"/>
         </w:tabs>
         <w:spacing w:before="60" w:after="60"/>
-        <w:ind w:left="2109" w:hanging="2109"/>
+        <w:ind w:left="2534" w:hanging="2534"/>
         <w:rPr>
           <w:sz w:val="24"/>
         </w:rPr>
@@ -153,18 +170,26 @@
       </w:r>
       <w:r>
         <w:rPr>
-          <w:sz w:val="24"/>
-        </w:rPr>
-        <w:t xml:space="preserve"> is the process of cutting a piece of wood to make decorative objects.</w:t>
+          <w:b/>
+          <w:sz w:val="24"/>
+        </w:rPr>
+        <w:tab/>
+      </w:r>
+      <w:r>
+        <w:rPr>
+          <w:sz w:val="24"/>
+        </w:rPr>
+        <w:t>is the process of cutting a piece of wood to make decorative objects.</w:t>
       </w:r>
     </w:p>
     <w:p>
       <w:pPr>
         <w:tabs>
           <w:tab w:val="left" w:pos="2109"/>
+          <w:tab w:val="left" w:pos="2534"/>
         </w:tabs>
         <w:spacing w:before="60" w:after="60"/>
-        <w:ind w:left="2109" w:hanging="2109"/>
+        <w:ind w:left="2534" w:hanging="2534"/>
         <w:rPr>
           <w:sz w:val="24"/>
         </w:rPr>
@@ -190,18 +215,26 @@
       </w:r>
       <w:r>
         <w:rPr>
-          <w:sz w:val="24"/>
-        </w:rPr>
-        <w:t xml:space="preserve"> means making very small replicas of real objects.</w:t>
+          <w:b/>
+          <w:sz w:val="24"/>
+        </w:rPr>
+        <w:tab/>
+      </w:r>
+      <w:r>
+        <w:rPr>
+          <w:sz w:val="24"/>
+        </w:rPr>
+        <w:t>means making very small replicas of real objects.</w:t>
       </w:r>
     </w:p>
     <w:p>
       <w:pPr>
         <w:tabs>
           <w:tab w:val="left" w:pos="2109"/>
+          <w:tab w:val="left" w:pos="2534"/>
         </w:tabs>
         <w:spacing w:before="60" w:after="60"/>
-        <w:ind w:left="2109" w:hanging="2109"/>
+        <w:ind w:left="2534" w:hanging="2534"/>
         <w:rPr>
           <w:sz w:val="24"/>
         </w:rPr>
@@ -227,18 +260,26 @@
       </w:r>
       <w:r>
         <w:rPr>
-          <w:sz w:val="24"/>
-        </w:rPr>
-        <w:t xml:space="preserve"> is the practice of growing and cultivating plants.</w:t>
+          <w:b/>
+          <w:sz w:val="24"/>
+        </w:rPr>
+        <w:tab/>
+      </w:r>
+      <w:r>
+        <w:rPr>
+          <w:sz w:val="24"/>
+        </w:rPr>
+        <w:t>is the practice of growing and cultivating plants.</w:t>
       </w:r>
     </w:p>
     <w:p>
       <w:pPr>
         <w:tabs>
           <w:tab w:val="left" w:pos="1984"/>
+          <w:tab w:val="left" w:pos="2409"/>
         </w:tabs>
         <w:spacing w:before="60" w:after="60"/>
-        <w:ind w:left="1984" w:hanging="1984"/>
+        <w:ind w:left="2409" w:hanging="2409"/>
         <w:rPr>
           <w:sz w:val="24"/>
         </w:rPr>
@@ -264,9 +305,16 @@
       </w:r>
       <w:r>
         <w:rPr>
-          <w:sz w:val="24"/>
-        </w:rPr>
-        <w:t xml:space="preserve"> develops your imagination and widens your knowledge.</w:t>
+          <w:b/>
+          <w:sz w:val="24"/>
+        </w:rPr>
+        <w:tab/>
+      </w:r>
+      <w:r>
+        <w:rPr>
+          <w:sz w:val="24"/>
+        </w:rPr>
+        <w:t>develops your imagination and widens your knowledge.</w:t>
       </w:r>
     </w:p>
     <w:p>
@@ -879,7 +927,7 @@
     <w:link w:val="Heading1Char"/>
     <w:uiPriority w:val="9"/>
     <w:qFormat/>
-    <w:rsid w:val="00266C46"/>
+    <w:rsid w:val="0069794F"/>
     <w:pPr>
       <w:keepNext/>
       <w:keepLines/>
@@ -902,7 +950,7 @@
     <w:semiHidden/>
     <w:unhideWhenUsed/>
     <w:qFormat/>
-    <w:rsid w:val="00266C46"/>
+    <w:rsid w:val="0069794F"/>
     <w:pPr>
       <w:keepNext/>
       <w:keepLines/>
@@ -925,7 +973,7 @@
     <w:semiHidden/>
     <w:unhideWhenUsed/>
     <w:qFormat/>
-    <w:rsid w:val="00266C46"/>
+    <w:rsid w:val="0069794F"/>
     <w:pPr>
       <w:keepNext/>
       <w:keepLines/>
@@ -948,7 +996,7 @@
     <w:semiHidden/>
     <w:unhideWhenUsed/>
     <w:qFormat/>
-    <w:rsid w:val="00266C46"/>
+    <w:rsid w:val="0069794F"/>
     <w:pPr>
       <w:keepNext/>
       <w:keepLines/>
@@ -971,7 +1019,7 @@
     <w:semiHidden/>
     <w:unhideWhenUsed/>
     <w:qFormat/>
-    <w:rsid w:val="00266C46"/>
+    <w:rsid w:val="0069794F"/>
     <w:pPr>
       <w:keepNext/>
       <w:keepLines/>
@@ -992,7 +1040,7 @@
     <w:semiHidden/>
     <w:unhideWhenUsed/>
     <w:qFormat/>
-    <w:rsid w:val="00266C46"/>
+    <w:rsid w:val="0069794F"/>
     <w:pPr>
       <w:keepNext/>
       <w:keepLines/>
@@ -1015,7 +1063,7 @@
     <w:semiHidden/>
     <w:unhideWhenUsed/>
     <w:qFormat/>
-    <w:rsid w:val="00266C46"/>
+    <w:rsid w:val="0069794F"/>
     <w:pPr>
       <w:keepNext/>
       <w:keepLines/>
@@ -1036,7 +1084,7 @@
     <w:semiHidden/>
     <w:unhideWhenUsed/>
     <w:qFormat/>
-    <w:rsid w:val="00266C46"/>
+    <w:rsid w:val="0069794F"/>
     <w:pPr>
       <w:keepNext/>
       <w:keepLines/>
@@ -1059,7 +1107,7 @@
     <w:semiHidden/>
     <w:unhideWhenUsed/>
     <w:qFormat/>
-    <w:rsid w:val="00266C46"/>
+    <w:rsid w:val="0069794F"/>
     <w:pPr>
       <w:keepNext/>
       <w:keepLines/>
@@ -1103,7 +1151,7 @@
     <w:basedOn w:val="DefaultParagraphFont"/>
     <w:link w:val="Heading1"/>
     <w:uiPriority w:val="9"/>
-    <w:rsid w:val="00266C46"/>
+    <w:rsid w:val="0069794F"/>
     <w:rPr>
       <w:rFonts w:asciiTheme="majorHAnsi" w:eastAsiaTheme="majorEastAsia" w:hAnsiTheme="majorHAnsi" w:cstheme="majorBidi"/>
       <w:color w:val="0F4761" w:themeColor="accent1" w:themeShade="BF"/>
@@ -1117,7 +1165,7 @@
     <w:link w:val="Heading2"/>
     <w:uiPriority w:val="9"/>
     <w:semiHidden/>
-    <w:rsid w:val="00266C46"/>
+    <w:rsid w:val="0069794F"/>
     <w:rPr>
       <w:rFonts w:asciiTheme="majorHAnsi" w:eastAsiaTheme="majorEastAsia" w:hAnsiTheme="majorHAnsi" w:cstheme="majorBidi"/>
       <w:color w:val="0F4761" w:themeColor="accent1" w:themeShade="BF"/>
@@ -1131,7 +1179,7 @@
     <w:link w:val="Heading3"/>
     <w:uiPriority w:val="9"/>
     <w:semiHidden/>
-    <w:rsid w:val="00266C46"/>
+    <w:rsid w:val="0069794F"/>
     <w:rPr>
       <w:rFonts w:asciiTheme="minorHAnsi" w:eastAsiaTheme="majorEastAsia" w:hAnsiTheme="minorHAnsi" w:cstheme="majorBidi"/>
       <w:color w:val="0F4761" w:themeColor="accent1" w:themeShade="BF"/>
@@ -1145,7 +1193,7 @@
     <w:link w:val="Heading4"/>
     <w:uiPriority w:val="9"/>
     <w:semiHidden/>
-    <w:rsid w:val="00266C46"/>
+    <w:rsid w:val="0069794F"/>
     <w:rPr>
       <w:rFonts w:asciiTheme="minorHAnsi" w:eastAsiaTheme="majorEastAsia" w:hAnsiTheme="minorHAnsi" w:cstheme="majorBidi"/>
       <w:i/>
@@ -1159,7 +1207,7 @@
     <w:link w:val="Heading5"/>
     <w:uiPriority w:val="9"/>
     <w:semiHidden/>
-    <w:rsid w:val="00266C46"/>
+    <w:rsid w:val="0069794F"/>
     <w:rPr>
       <w:rFonts w:asciiTheme="minorHAnsi" w:eastAsiaTheme="majorEastAsia" w:hAnsiTheme="minorHAnsi" w:cstheme="majorBidi"/>
       <w:color w:val="0F4761" w:themeColor="accent1" w:themeShade="BF"/>
@@ -1171,7 +1219,7 @@
     <w:link w:val="Heading6"/>
     <w:uiPriority w:val="9"/>
     <w:semiHidden/>
-    <w:rsid w:val="00266C46"/>
+    <w:rsid w:val="0069794F"/>
     <w:rPr>
       <w:rFonts w:asciiTheme="minorHAnsi" w:eastAsiaTheme="majorEastAsia" w:hAnsiTheme="minorHAnsi" w:cstheme="majorBidi"/>
       <w:i/>
@@ -1185,7 +1233,7 @@
     <w:link w:val="Heading7"/>
     <w:uiPriority w:val="9"/>
     <w:semiHidden/>
-    <w:rsid w:val="00266C46"/>
+    <w:rsid w:val="0069794F"/>
     <w:rPr>
       <w:rFonts w:asciiTheme="minorHAnsi" w:eastAsiaTheme="majorEastAsia" w:hAnsiTheme="minorHAnsi" w:cstheme="majorBidi"/>
       <w:color w:val="595959" w:themeColor="text1" w:themeTint="A6"/>
@@ -1197,7 +1245,7 @@
     <w:link w:val="Heading8"/>
     <w:uiPriority w:val="9"/>
     <w:semiHidden/>
-    <w:rsid w:val="00266C46"/>
+    <w:rsid w:val="0069794F"/>
     <w:rPr>
       <w:rFonts w:asciiTheme="minorHAnsi" w:eastAsiaTheme="majorEastAsia" w:hAnsiTheme="minorHAnsi" w:cstheme="majorBidi"/>
       <w:i/>
@@ -1211,7 +1259,7 @@
     <w:link w:val="Heading9"/>
     <w:uiPriority w:val="9"/>
     <w:semiHidden/>
-    <w:rsid w:val="00266C46"/>
+    <w:rsid w:val="0069794F"/>
     <w:rPr>
       <w:rFonts w:asciiTheme="minorHAnsi" w:eastAsiaTheme="majorEastAsia" w:hAnsiTheme="minorHAnsi" w:cstheme="majorBidi"/>
       <w:color w:val="272727" w:themeColor="text1" w:themeTint="D8"/>
@@ -1224,7 +1272,7 @@
     <w:link w:val="TitleChar"/>
     <w:uiPriority w:val="10"/>
     <w:qFormat/>
-    <w:rsid w:val="00266C46"/>
+    <w:rsid w:val="0069794F"/>
     <w:pPr>
       <w:spacing w:after="80" w:line="240" w:lineRule="auto"/>
       <w:contextualSpacing/>
@@ -1242,7 +1290,7 @@
     <w:basedOn w:val="DefaultParagraphFont"/>
     <w:link w:val="Title"/>
     <w:uiPriority w:val="10"/>
-    <w:rsid w:val="00266C46"/>
+    <w:rsid w:val="0069794F"/>
     <w:rPr>
       <w:rFonts w:asciiTheme="majorHAnsi" w:eastAsiaTheme="majorEastAsia" w:hAnsiTheme="majorHAnsi" w:cstheme="majorBidi"/>
       <w:spacing w:val="-10"/>
@@ -1258,7 +1306,7 @@
     <w:link w:val="SubtitleChar"/>
     <w:uiPriority w:val="11"/>
     <w:qFormat/>
-    <w:rsid w:val="00266C46"/>
+    <w:rsid w:val="0069794F"/>
     <w:pPr>
       <w:numPr>
         <w:ilvl w:val="1"/>
@@ -1277,7 +1325,7 @@
     <w:basedOn w:val="DefaultParagraphFont"/>
     <w:link w:val="Subtitle"/>
     <w:uiPriority w:val="11"/>
-    <w:rsid w:val="00266C46"/>
+    <w:rsid w:val="0069794F"/>
     <w:rPr>
       <w:rFonts w:asciiTheme="minorHAnsi" w:eastAsiaTheme="majorEastAsia" w:hAnsiTheme="minorHAnsi" w:cstheme="majorBidi"/>
       <w:color w:val="595959" w:themeColor="text1" w:themeTint="A6"/>
@@ -1293,7 +1341,7 @@
     <w:link w:val="QuoteChar"/>
     <w:uiPriority w:val="29"/>
     <w:qFormat/>
-    <w:rsid w:val="00266C46"/>
+    <w:rsid w:val="0069794F"/>
     <w:pPr>
       <w:spacing w:before="160"/>
       <w:jc w:val="center"/>
@@ -1309,7 +1357,7 @@
     <w:basedOn w:val="DefaultParagraphFont"/>
     <w:link w:val="Quote"/>
     <w:uiPriority w:val="29"/>
-    <w:rsid w:val="00266C46"/>
+    <w:rsid w:val="0069794F"/>
     <w:rPr>
       <w:i/>
       <w:iCs/>
@@ -1321,7 +1369,7 @@
     <w:basedOn w:val="Normal"/>
     <w:uiPriority w:val="34"/>
     <w:qFormat/>
-    <w:rsid w:val="00266C46"/>
+    <w:rsid w:val="0069794F"/>
     <w:pPr>
       <w:ind w:left="720"/>
       <w:contextualSpacing/>
@@ -1332,7 +1380,7 @@
     <w:basedOn w:val="DefaultParagraphFont"/>
     <w:uiPriority w:val="21"/>
     <w:qFormat/>
-    <w:rsid w:val="00266C46"/>
+    <w:rsid w:val="0069794F"/>
     <w:rPr>
       <w:i/>
       <w:iCs/>
@@ -1346,7 +1394,7 @@
     <w:link w:val="IntenseQuoteChar"/>
     <w:uiPriority w:val="30"/>
     <w:qFormat/>
-    <w:rsid w:val="00266C46"/>
+    <w:rsid w:val="0069794F"/>
     <w:pPr>
       <w:pBdr>
         <w:top w:val="single" w:sz="4" w:space="10" w:color="0F4761" w:themeColor="accent1" w:themeShade="BF"/>
@@ -1367,7 +1415,7 @@
     <w:basedOn w:val="DefaultParagraphFont"/>
     <w:link w:val="IntenseQuote"/>
     <w:uiPriority w:val="30"/>
-    <w:rsid w:val="00266C46"/>
+    <w:rsid w:val="0069794F"/>
     <w:rPr>
       <w:i/>
       <w:iCs/>
@@ -1379,7 +1427,7 @@
     <w:basedOn w:val="DefaultParagraphFont"/>
     <w:uiPriority w:val="32"/>
     <w:qFormat/>
-    <w:rsid w:val="00266C46"/>
+    <w:rsid w:val="0069794F"/>
     <w:rPr>
       <w:b/>
       <w:bCs/>
@@ -1394,7 +1442,7 @@
     <w:link w:val="HeaderChar"/>
     <w:uiPriority w:val="99"/>
     <w:unhideWhenUsed/>
-    <w:rsid w:val="00266C46"/>
+    <w:rsid w:val="0069794F"/>
     <w:pPr>
       <w:tabs>
         <w:tab w:val="center" w:pos="4680"/>
@@ -1408,7 +1456,7 @@
     <w:basedOn w:val="DefaultParagraphFont"/>
     <w:link w:val="Header"/>
     <w:uiPriority w:val="99"/>
-    <w:rsid w:val="00266C46"/>
+    <w:rsid w:val="0069794F"/>
   </w:style>
   <w:style w:type="paragraph" w:styleId="Footer">
     <w:name w:val="footer"/>
@@ -1416,7 +1464,7 @@
     <w:link w:val="FooterChar"/>
     <w:uiPriority w:val="99"/>
     <w:unhideWhenUsed/>
-    <w:rsid w:val="00266C46"/>
+    <w:rsid w:val="0069794F"/>
     <w:pPr>
       <w:tabs>
         <w:tab w:val="center" w:pos="4680"/>
@@ -1430,7 +1478,7 @@
     <w:basedOn w:val="DefaultParagraphFont"/>
     <w:link w:val="Footer"/>
     <w:uiPriority w:val="99"/>
-    <w:rsid w:val="00266C46"/>
+    <w:rsid w:val="0069794F"/>
   </w:style>
 </w:styles>
 </file>

</xml_diff>

<commit_message>
fix: scan backward to find true TAB2 group start so col2_tab_pos_cm is identical for every row in a group
</commit_message>
<xml_diff>
--- a/output/test_header_center.docx
+++ b/output/test_header_center.docx
@@ -51,10 +51,9 @@
       <w:pPr>
         <w:tabs>
           <w:tab w:val="left" w:pos="2517"/>
-          <w:tab w:val="left" w:pos="2942"/>
         </w:tabs>
         <w:spacing w:before="60" w:after="60"/>
-        <w:ind w:left="2942" w:hanging="2942"/>
+        <w:ind w:left="2517" w:hanging="2517"/>
         <w:rPr>
           <w:sz w:val="24"/>
         </w:rPr>
@@ -80,26 +79,18 @@
       </w:r>
       <w:r>
         <w:rPr>
-          <w:b/>
-          <w:sz w:val="24"/>
-        </w:rPr>
-        <w:tab/>
-      </w:r>
-      <w:r>
-        <w:rPr>
-          <w:sz w:val="24"/>
-        </w:rPr>
-        <w:t>helps you learn about different countries and their currencies.</w:t>
+          <w:sz w:val="24"/>
+        </w:rPr>
+        <w:t xml:space="preserve"> helps you learn about different countries and their currencies.</w:t>
       </w:r>
     </w:p>
     <w:p>
       <w:pPr>
         <w:tabs>
           <w:tab w:val="left" w:pos="2517"/>
-          <w:tab w:val="left" w:pos="2942"/>
         </w:tabs>
         <w:spacing w:before="60" w:after="60"/>
-        <w:ind w:left="2942" w:hanging="2942"/>
+        <w:ind w:left="2517" w:hanging="2517"/>
         <w:rPr>
           <w:sz w:val="24"/>
         </w:rPr>
@@ -125,26 +116,18 @@
       </w:r>
       <w:r>
         <w:rPr>
-          <w:b/>
-          <w:sz w:val="24"/>
-        </w:rPr>
-        <w:tab/>
-      </w:r>
-      <w:r>
-        <w:rPr>
-          <w:sz w:val="24"/>
-        </w:rPr>
-        <w:t>needs a pattern, a needle and threads.</w:t>
+          <w:sz w:val="24"/>
+        </w:rPr>
+        <w:t xml:space="preserve"> needs a pattern, a needle and threads.</w:t>
       </w:r>
     </w:p>
     <w:p>
       <w:pPr>
         <w:tabs>
-          <w:tab w:val="left" w:pos="2109"/>
-          <w:tab w:val="left" w:pos="2534"/>
+          <w:tab w:val="left" w:pos="2517"/>
         </w:tabs>
         <w:spacing w:before="60" w:after="60"/>
-        <w:ind w:left="2534" w:hanging="2534"/>
+        <w:ind w:left="2517" w:hanging="2517"/>
         <w:rPr>
           <w:sz w:val="24"/>
         </w:rPr>
@@ -170,26 +153,18 @@
       </w:r>
       <w:r>
         <w:rPr>
-          <w:b/>
-          <w:sz w:val="24"/>
-        </w:rPr>
-        <w:tab/>
-      </w:r>
-      <w:r>
-        <w:rPr>
-          <w:sz w:val="24"/>
-        </w:rPr>
-        <w:t>is the process of cutting a piece of wood to make decorative objects.</w:t>
+          <w:sz w:val="24"/>
+        </w:rPr>
+        <w:t xml:space="preserve"> is the process of cutting a piece of wood to make decorative objects.</w:t>
       </w:r>
     </w:p>
     <w:p>
       <w:pPr>
         <w:tabs>
-          <w:tab w:val="left" w:pos="2109"/>
-          <w:tab w:val="left" w:pos="2534"/>
+          <w:tab w:val="left" w:pos="2517"/>
         </w:tabs>
         <w:spacing w:before="60" w:after="60"/>
-        <w:ind w:left="2534" w:hanging="2534"/>
+        <w:ind w:left="2517" w:hanging="2517"/>
         <w:rPr>
           <w:sz w:val="24"/>
         </w:rPr>
@@ -215,26 +190,18 @@
       </w:r>
       <w:r>
         <w:rPr>
-          <w:b/>
-          <w:sz w:val="24"/>
-        </w:rPr>
-        <w:tab/>
-      </w:r>
-      <w:r>
-        <w:rPr>
-          <w:sz w:val="24"/>
-        </w:rPr>
-        <w:t>means making very small replicas of real objects.</w:t>
+          <w:sz w:val="24"/>
+        </w:rPr>
+        <w:t xml:space="preserve"> means making very small replicas of real objects.</w:t>
       </w:r>
     </w:p>
     <w:p>
       <w:pPr>
         <w:tabs>
-          <w:tab w:val="left" w:pos="2109"/>
-          <w:tab w:val="left" w:pos="2534"/>
+          <w:tab w:val="left" w:pos="2517"/>
         </w:tabs>
         <w:spacing w:before="60" w:after="60"/>
-        <w:ind w:left="2534" w:hanging="2534"/>
+        <w:ind w:left="2517" w:hanging="2517"/>
         <w:rPr>
           <w:sz w:val="24"/>
         </w:rPr>
@@ -260,26 +227,18 @@
       </w:r>
       <w:r>
         <w:rPr>
-          <w:b/>
-          <w:sz w:val="24"/>
-        </w:rPr>
-        <w:tab/>
-      </w:r>
-      <w:r>
-        <w:rPr>
-          <w:sz w:val="24"/>
-        </w:rPr>
-        <w:t>is the practice of growing and cultivating plants.</w:t>
+          <w:sz w:val="24"/>
+        </w:rPr>
+        <w:t xml:space="preserve"> is the practice of growing and cultivating plants.</w:t>
       </w:r>
     </w:p>
     <w:p>
       <w:pPr>
         <w:tabs>
-          <w:tab w:val="left" w:pos="1984"/>
-          <w:tab w:val="left" w:pos="2409"/>
+          <w:tab w:val="left" w:pos="2517"/>
         </w:tabs>
         <w:spacing w:before="60" w:after="60"/>
-        <w:ind w:left="2409" w:hanging="2409"/>
+        <w:ind w:left="2517" w:hanging="2517"/>
         <w:rPr>
           <w:sz w:val="24"/>
         </w:rPr>
@@ -305,16 +264,9 @@
       </w:r>
       <w:r>
         <w:rPr>
-          <w:b/>
-          <w:sz w:val="24"/>
-        </w:rPr>
-        <w:tab/>
-      </w:r>
-      <w:r>
-        <w:rPr>
-          <w:sz w:val="24"/>
-        </w:rPr>
-        <w:t>develops your imagination and widens your knowledge.</w:t>
+          <w:sz w:val="24"/>
+        </w:rPr>
+        <w:t xml:space="preserve"> develops your imagination and widens your knowledge.</w:t>
       </w:r>
     </w:p>
     <w:p>
@@ -927,7 +879,7 @@
     <w:link w:val="Heading1Char"/>
     <w:uiPriority w:val="9"/>
     <w:qFormat/>
-    <w:rsid w:val="0069794F"/>
+    <w:rsid w:val="00660C11"/>
     <w:pPr>
       <w:keepNext/>
       <w:keepLines/>
@@ -950,7 +902,7 @@
     <w:semiHidden/>
     <w:unhideWhenUsed/>
     <w:qFormat/>
-    <w:rsid w:val="0069794F"/>
+    <w:rsid w:val="00660C11"/>
     <w:pPr>
       <w:keepNext/>
       <w:keepLines/>
@@ -973,7 +925,7 @@
     <w:semiHidden/>
     <w:unhideWhenUsed/>
     <w:qFormat/>
-    <w:rsid w:val="0069794F"/>
+    <w:rsid w:val="00660C11"/>
     <w:pPr>
       <w:keepNext/>
       <w:keepLines/>
@@ -996,7 +948,7 @@
     <w:semiHidden/>
     <w:unhideWhenUsed/>
     <w:qFormat/>
-    <w:rsid w:val="0069794F"/>
+    <w:rsid w:val="00660C11"/>
     <w:pPr>
       <w:keepNext/>
       <w:keepLines/>
@@ -1019,7 +971,7 @@
     <w:semiHidden/>
     <w:unhideWhenUsed/>
     <w:qFormat/>
-    <w:rsid w:val="0069794F"/>
+    <w:rsid w:val="00660C11"/>
     <w:pPr>
       <w:keepNext/>
       <w:keepLines/>
@@ -1040,7 +992,7 @@
     <w:semiHidden/>
     <w:unhideWhenUsed/>
     <w:qFormat/>
-    <w:rsid w:val="0069794F"/>
+    <w:rsid w:val="00660C11"/>
     <w:pPr>
       <w:keepNext/>
       <w:keepLines/>
@@ -1063,7 +1015,7 @@
     <w:semiHidden/>
     <w:unhideWhenUsed/>
     <w:qFormat/>
-    <w:rsid w:val="0069794F"/>
+    <w:rsid w:val="00660C11"/>
     <w:pPr>
       <w:keepNext/>
       <w:keepLines/>
@@ -1084,7 +1036,7 @@
     <w:semiHidden/>
     <w:unhideWhenUsed/>
     <w:qFormat/>
-    <w:rsid w:val="0069794F"/>
+    <w:rsid w:val="00660C11"/>
     <w:pPr>
       <w:keepNext/>
       <w:keepLines/>
@@ -1107,7 +1059,7 @@
     <w:semiHidden/>
     <w:unhideWhenUsed/>
     <w:qFormat/>
-    <w:rsid w:val="0069794F"/>
+    <w:rsid w:val="00660C11"/>
     <w:pPr>
       <w:keepNext/>
       <w:keepLines/>
@@ -1151,7 +1103,7 @@
     <w:basedOn w:val="DefaultParagraphFont"/>
     <w:link w:val="Heading1"/>
     <w:uiPriority w:val="9"/>
-    <w:rsid w:val="0069794F"/>
+    <w:rsid w:val="00660C11"/>
     <w:rPr>
       <w:rFonts w:asciiTheme="majorHAnsi" w:eastAsiaTheme="majorEastAsia" w:hAnsiTheme="majorHAnsi" w:cstheme="majorBidi"/>
       <w:color w:val="0F4761" w:themeColor="accent1" w:themeShade="BF"/>
@@ -1165,7 +1117,7 @@
     <w:link w:val="Heading2"/>
     <w:uiPriority w:val="9"/>
     <w:semiHidden/>
-    <w:rsid w:val="0069794F"/>
+    <w:rsid w:val="00660C11"/>
     <w:rPr>
       <w:rFonts w:asciiTheme="majorHAnsi" w:eastAsiaTheme="majorEastAsia" w:hAnsiTheme="majorHAnsi" w:cstheme="majorBidi"/>
       <w:color w:val="0F4761" w:themeColor="accent1" w:themeShade="BF"/>
@@ -1179,7 +1131,7 @@
     <w:link w:val="Heading3"/>
     <w:uiPriority w:val="9"/>
     <w:semiHidden/>
-    <w:rsid w:val="0069794F"/>
+    <w:rsid w:val="00660C11"/>
     <w:rPr>
       <w:rFonts w:asciiTheme="minorHAnsi" w:eastAsiaTheme="majorEastAsia" w:hAnsiTheme="minorHAnsi" w:cstheme="majorBidi"/>
       <w:color w:val="0F4761" w:themeColor="accent1" w:themeShade="BF"/>
@@ -1193,7 +1145,7 @@
     <w:link w:val="Heading4"/>
     <w:uiPriority w:val="9"/>
     <w:semiHidden/>
-    <w:rsid w:val="0069794F"/>
+    <w:rsid w:val="00660C11"/>
     <w:rPr>
       <w:rFonts w:asciiTheme="minorHAnsi" w:eastAsiaTheme="majorEastAsia" w:hAnsiTheme="minorHAnsi" w:cstheme="majorBidi"/>
       <w:i/>
@@ -1207,7 +1159,7 @@
     <w:link w:val="Heading5"/>
     <w:uiPriority w:val="9"/>
     <w:semiHidden/>
-    <w:rsid w:val="0069794F"/>
+    <w:rsid w:val="00660C11"/>
     <w:rPr>
       <w:rFonts w:asciiTheme="minorHAnsi" w:eastAsiaTheme="majorEastAsia" w:hAnsiTheme="minorHAnsi" w:cstheme="majorBidi"/>
       <w:color w:val="0F4761" w:themeColor="accent1" w:themeShade="BF"/>
@@ -1219,7 +1171,7 @@
     <w:link w:val="Heading6"/>
     <w:uiPriority w:val="9"/>
     <w:semiHidden/>
-    <w:rsid w:val="0069794F"/>
+    <w:rsid w:val="00660C11"/>
     <w:rPr>
       <w:rFonts w:asciiTheme="minorHAnsi" w:eastAsiaTheme="majorEastAsia" w:hAnsiTheme="minorHAnsi" w:cstheme="majorBidi"/>
       <w:i/>
@@ -1233,7 +1185,7 @@
     <w:link w:val="Heading7"/>
     <w:uiPriority w:val="9"/>
     <w:semiHidden/>
-    <w:rsid w:val="0069794F"/>
+    <w:rsid w:val="00660C11"/>
     <w:rPr>
       <w:rFonts w:asciiTheme="minorHAnsi" w:eastAsiaTheme="majorEastAsia" w:hAnsiTheme="minorHAnsi" w:cstheme="majorBidi"/>
       <w:color w:val="595959" w:themeColor="text1" w:themeTint="A6"/>
@@ -1245,7 +1197,7 @@
     <w:link w:val="Heading8"/>
     <w:uiPriority w:val="9"/>
     <w:semiHidden/>
-    <w:rsid w:val="0069794F"/>
+    <w:rsid w:val="00660C11"/>
     <w:rPr>
       <w:rFonts w:asciiTheme="minorHAnsi" w:eastAsiaTheme="majorEastAsia" w:hAnsiTheme="minorHAnsi" w:cstheme="majorBidi"/>
       <w:i/>
@@ -1259,7 +1211,7 @@
     <w:link w:val="Heading9"/>
     <w:uiPriority w:val="9"/>
     <w:semiHidden/>
-    <w:rsid w:val="0069794F"/>
+    <w:rsid w:val="00660C11"/>
     <w:rPr>
       <w:rFonts w:asciiTheme="minorHAnsi" w:eastAsiaTheme="majorEastAsia" w:hAnsiTheme="minorHAnsi" w:cstheme="majorBidi"/>
       <w:color w:val="272727" w:themeColor="text1" w:themeTint="D8"/>
@@ -1272,7 +1224,7 @@
     <w:link w:val="TitleChar"/>
     <w:uiPriority w:val="10"/>
     <w:qFormat/>
-    <w:rsid w:val="0069794F"/>
+    <w:rsid w:val="00660C11"/>
     <w:pPr>
       <w:spacing w:after="80" w:line="240" w:lineRule="auto"/>
       <w:contextualSpacing/>
@@ -1290,7 +1242,7 @@
     <w:basedOn w:val="DefaultParagraphFont"/>
     <w:link w:val="Title"/>
     <w:uiPriority w:val="10"/>
-    <w:rsid w:val="0069794F"/>
+    <w:rsid w:val="00660C11"/>
     <w:rPr>
       <w:rFonts w:asciiTheme="majorHAnsi" w:eastAsiaTheme="majorEastAsia" w:hAnsiTheme="majorHAnsi" w:cstheme="majorBidi"/>
       <w:spacing w:val="-10"/>
@@ -1306,7 +1258,7 @@
     <w:link w:val="SubtitleChar"/>
     <w:uiPriority w:val="11"/>
     <w:qFormat/>
-    <w:rsid w:val="0069794F"/>
+    <w:rsid w:val="00660C11"/>
     <w:pPr>
       <w:numPr>
         <w:ilvl w:val="1"/>
@@ -1325,7 +1277,7 @@
     <w:basedOn w:val="DefaultParagraphFont"/>
     <w:link w:val="Subtitle"/>
     <w:uiPriority w:val="11"/>
-    <w:rsid w:val="0069794F"/>
+    <w:rsid w:val="00660C11"/>
     <w:rPr>
       <w:rFonts w:asciiTheme="minorHAnsi" w:eastAsiaTheme="majorEastAsia" w:hAnsiTheme="minorHAnsi" w:cstheme="majorBidi"/>
       <w:color w:val="595959" w:themeColor="text1" w:themeTint="A6"/>
@@ -1341,7 +1293,7 @@
     <w:link w:val="QuoteChar"/>
     <w:uiPriority w:val="29"/>
     <w:qFormat/>
-    <w:rsid w:val="0069794F"/>
+    <w:rsid w:val="00660C11"/>
     <w:pPr>
       <w:spacing w:before="160"/>
       <w:jc w:val="center"/>
@@ -1357,7 +1309,7 @@
     <w:basedOn w:val="DefaultParagraphFont"/>
     <w:link w:val="Quote"/>
     <w:uiPriority w:val="29"/>
-    <w:rsid w:val="0069794F"/>
+    <w:rsid w:val="00660C11"/>
     <w:rPr>
       <w:i/>
       <w:iCs/>
@@ -1369,7 +1321,7 @@
     <w:basedOn w:val="Normal"/>
     <w:uiPriority w:val="34"/>
     <w:qFormat/>
-    <w:rsid w:val="0069794F"/>
+    <w:rsid w:val="00660C11"/>
     <w:pPr>
       <w:ind w:left="720"/>
       <w:contextualSpacing/>
@@ -1380,7 +1332,7 @@
     <w:basedOn w:val="DefaultParagraphFont"/>
     <w:uiPriority w:val="21"/>
     <w:qFormat/>
-    <w:rsid w:val="0069794F"/>
+    <w:rsid w:val="00660C11"/>
     <w:rPr>
       <w:i/>
       <w:iCs/>
@@ -1394,7 +1346,7 @@
     <w:link w:val="IntenseQuoteChar"/>
     <w:uiPriority w:val="30"/>
     <w:qFormat/>
-    <w:rsid w:val="0069794F"/>
+    <w:rsid w:val="00660C11"/>
     <w:pPr>
       <w:pBdr>
         <w:top w:val="single" w:sz="4" w:space="10" w:color="0F4761" w:themeColor="accent1" w:themeShade="BF"/>
@@ -1415,7 +1367,7 @@
     <w:basedOn w:val="DefaultParagraphFont"/>
     <w:link w:val="IntenseQuote"/>
     <w:uiPriority w:val="30"/>
-    <w:rsid w:val="0069794F"/>
+    <w:rsid w:val="00660C11"/>
     <w:rPr>
       <w:i/>
       <w:iCs/>
@@ -1427,7 +1379,7 @@
     <w:basedOn w:val="DefaultParagraphFont"/>
     <w:uiPriority w:val="32"/>
     <w:qFormat/>
-    <w:rsid w:val="0069794F"/>
+    <w:rsid w:val="00660C11"/>
     <w:rPr>
       <w:b/>
       <w:bCs/>
@@ -1442,7 +1394,7 @@
     <w:link w:val="HeaderChar"/>
     <w:uiPriority w:val="99"/>
     <w:unhideWhenUsed/>
-    <w:rsid w:val="0069794F"/>
+    <w:rsid w:val="00660C11"/>
     <w:pPr>
       <w:tabs>
         <w:tab w:val="center" w:pos="4680"/>
@@ -1456,7 +1408,7 @@
     <w:basedOn w:val="DefaultParagraphFont"/>
     <w:link w:val="Header"/>
     <w:uiPriority w:val="99"/>
-    <w:rsid w:val="0069794F"/>
+    <w:rsid w:val="00660C11"/>
   </w:style>
   <w:style w:type="paragraph" w:styleId="Footer">
     <w:name w:val="footer"/>
@@ -1464,7 +1416,7 @@
     <w:link w:val="FooterChar"/>
     <w:uiPriority w:val="99"/>
     <w:unhideWhenUsed/>
-    <w:rsid w:val="0069794F"/>
+    <w:rsid w:val="00660C11"/>
     <w:pPr>
       <w:tabs>
         <w:tab w:val="center" w:pos="4680"/>
@@ -1478,7 +1430,7 @@
     <w:basedOn w:val="DefaultParagraphFont"/>
     <w:link w:val="Footer"/>
     <w:uiPriority w:val="99"/>
-    <w:rsid w:val="0069794F"/>
+    <w:rsid w:val="00660C11"/>
   </w:style>
 </w:styles>
 </file>

</xml_diff>

<commit_message>
fix: optimize TAB2 col1_needed_cm to max(2.5, max_c1_len * 0.15 + 0.5) to give Column 2 maximum width and eliminate text wrapping
</commit_message>
<xml_diff>
--- a/output/test_header_center.docx
+++ b/output/test_header_center.docx
@@ -21,8 +21,8 @@
     <w:p>
       <w:pPr>
         <w:tabs>
-          <w:tab w:val="center" w:pos="1259"/>
-          <w:tab w:val="center" w:pos="5936"/>
+          <w:tab w:val="center" w:pos="907"/>
+          <w:tab w:val="center" w:pos="5584"/>
         </w:tabs>
         <w:spacing w:before="60" w:after="60"/>
         <w:rPr>
@@ -50,10 +50,10 @@
     <w:p>
       <w:pPr>
         <w:tabs>
-          <w:tab w:val="left" w:pos="2517"/>
+          <w:tab w:val="left" w:pos="1814"/>
         </w:tabs>
         <w:spacing w:before="60" w:after="60"/>
-        <w:ind w:left="2517" w:hanging="2517"/>
+        <w:ind w:left="1814" w:hanging="1814"/>
         <w:rPr>
           <w:sz w:val="24"/>
         </w:rPr>
@@ -87,10 +87,10 @@
     <w:p>
       <w:pPr>
         <w:tabs>
-          <w:tab w:val="left" w:pos="2517"/>
+          <w:tab w:val="left" w:pos="1814"/>
         </w:tabs>
         <w:spacing w:before="60" w:after="60"/>
-        <w:ind w:left="2517" w:hanging="2517"/>
+        <w:ind w:left="1814" w:hanging="1814"/>
         <w:rPr>
           <w:sz w:val="24"/>
         </w:rPr>
@@ -124,10 +124,10 @@
     <w:p>
       <w:pPr>
         <w:tabs>
-          <w:tab w:val="left" w:pos="2517"/>
+          <w:tab w:val="left" w:pos="1814"/>
         </w:tabs>
         <w:spacing w:before="60" w:after="60"/>
-        <w:ind w:left="2517" w:hanging="2517"/>
+        <w:ind w:left="1814" w:hanging="1814"/>
         <w:rPr>
           <w:sz w:val="24"/>
         </w:rPr>
@@ -161,10 +161,10 @@
     <w:p>
       <w:pPr>
         <w:tabs>
-          <w:tab w:val="left" w:pos="2517"/>
+          <w:tab w:val="left" w:pos="1814"/>
         </w:tabs>
         <w:spacing w:before="60" w:after="60"/>
-        <w:ind w:left="2517" w:hanging="2517"/>
+        <w:ind w:left="1814" w:hanging="1814"/>
         <w:rPr>
           <w:sz w:val="24"/>
         </w:rPr>
@@ -198,10 +198,10 @@
     <w:p>
       <w:pPr>
         <w:tabs>
-          <w:tab w:val="left" w:pos="2517"/>
+          <w:tab w:val="left" w:pos="1814"/>
         </w:tabs>
         <w:spacing w:before="60" w:after="60"/>
-        <w:ind w:left="2517" w:hanging="2517"/>
+        <w:ind w:left="1814" w:hanging="1814"/>
         <w:rPr>
           <w:sz w:val="24"/>
         </w:rPr>
@@ -235,10 +235,10 @@
     <w:p>
       <w:pPr>
         <w:tabs>
-          <w:tab w:val="left" w:pos="2517"/>
+          <w:tab w:val="left" w:pos="1814"/>
         </w:tabs>
         <w:spacing w:before="60" w:after="60"/>
-        <w:ind w:left="2517" w:hanging="2517"/>
+        <w:ind w:left="1814" w:hanging="1814"/>
         <w:rPr>
           <w:sz w:val="24"/>
         </w:rPr>
@@ -879,7 +879,7 @@
     <w:link w:val="Heading1Char"/>
     <w:uiPriority w:val="9"/>
     <w:qFormat/>
-    <w:rsid w:val="00660C11"/>
+    <w:rsid w:val="00A20AA5"/>
     <w:pPr>
       <w:keepNext/>
       <w:keepLines/>
@@ -902,7 +902,7 @@
     <w:semiHidden/>
     <w:unhideWhenUsed/>
     <w:qFormat/>
-    <w:rsid w:val="00660C11"/>
+    <w:rsid w:val="00A20AA5"/>
     <w:pPr>
       <w:keepNext/>
       <w:keepLines/>
@@ -925,7 +925,7 @@
     <w:semiHidden/>
     <w:unhideWhenUsed/>
     <w:qFormat/>
-    <w:rsid w:val="00660C11"/>
+    <w:rsid w:val="00A20AA5"/>
     <w:pPr>
       <w:keepNext/>
       <w:keepLines/>
@@ -948,7 +948,7 @@
     <w:semiHidden/>
     <w:unhideWhenUsed/>
     <w:qFormat/>
-    <w:rsid w:val="00660C11"/>
+    <w:rsid w:val="00A20AA5"/>
     <w:pPr>
       <w:keepNext/>
       <w:keepLines/>
@@ -971,7 +971,7 @@
     <w:semiHidden/>
     <w:unhideWhenUsed/>
     <w:qFormat/>
-    <w:rsid w:val="00660C11"/>
+    <w:rsid w:val="00A20AA5"/>
     <w:pPr>
       <w:keepNext/>
       <w:keepLines/>
@@ -992,7 +992,7 @@
     <w:semiHidden/>
     <w:unhideWhenUsed/>
     <w:qFormat/>
-    <w:rsid w:val="00660C11"/>
+    <w:rsid w:val="00A20AA5"/>
     <w:pPr>
       <w:keepNext/>
       <w:keepLines/>
@@ -1015,7 +1015,7 @@
     <w:semiHidden/>
     <w:unhideWhenUsed/>
     <w:qFormat/>
-    <w:rsid w:val="00660C11"/>
+    <w:rsid w:val="00A20AA5"/>
     <w:pPr>
       <w:keepNext/>
       <w:keepLines/>
@@ -1036,7 +1036,7 @@
     <w:semiHidden/>
     <w:unhideWhenUsed/>
     <w:qFormat/>
-    <w:rsid w:val="00660C11"/>
+    <w:rsid w:val="00A20AA5"/>
     <w:pPr>
       <w:keepNext/>
       <w:keepLines/>
@@ -1059,7 +1059,7 @@
     <w:semiHidden/>
     <w:unhideWhenUsed/>
     <w:qFormat/>
-    <w:rsid w:val="00660C11"/>
+    <w:rsid w:val="00A20AA5"/>
     <w:pPr>
       <w:keepNext/>
       <w:keepLines/>
@@ -1103,7 +1103,7 @@
     <w:basedOn w:val="DefaultParagraphFont"/>
     <w:link w:val="Heading1"/>
     <w:uiPriority w:val="9"/>
-    <w:rsid w:val="00660C11"/>
+    <w:rsid w:val="00A20AA5"/>
     <w:rPr>
       <w:rFonts w:asciiTheme="majorHAnsi" w:eastAsiaTheme="majorEastAsia" w:hAnsiTheme="majorHAnsi" w:cstheme="majorBidi"/>
       <w:color w:val="0F4761" w:themeColor="accent1" w:themeShade="BF"/>
@@ -1117,7 +1117,7 @@
     <w:link w:val="Heading2"/>
     <w:uiPriority w:val="9"/>
     <w:semiHidden/>
-    <w:rsid w:val="00660C11"/>
+    <w:rsid w:val="00A20AA5"/>
     <w:rPr>
       <w:rFonts w:asciiTheme="majorHAnsi" w:eastAsiaTheme="majorEastAsia" w:hAnsiTheme="majorHAnsi" w:cstheme="majorBidi"/>
       <w:color w:val="0F4761" w:themeColor="accent1" w:themeShade="BF"/>
@@ -1131,7 +1131,7 @@
     <w:link w:val="Heading3"/>
     <w:uiPriority w:val="9"/>
     <w:semiHidden/>
-    <w:rsid w:val="00660C11"/>
+    <w:rsid w:val="00A20AA5"/>
     <w:rPr>
       <w:rFonts w:asciiTheme="minorHAnsi" w:eastAsiaTheme="majorEastAsia" w:hAnsiTheme="minorHAnsi" w:cstheme="majorBidi"/>
       <w:color w:val="0F4761" w:themeColor="accent1" w:themeShade="BF"/>
@@ -1145,7 +1145,7 @@
     <w:link w:val="Heading4"/>
     <w:uiPriority w:val="9"/>
     <w:semiHidden/>
-    <w:rsid w:val="00660C11"/>
+    <w:rsid w:val="00A20AA5"/>
     <w:rPr>
       <w:rFonts w:asciiTheme="minorHAnsi" w:eastAsiaTheme="majorEastAsia" w:hAnsiTheme="minorHAnsi" w:cstheme="majorBidi"/>
       <w:i/>
@@ -1159,7 +1159,7 @@
     <w:link w:val="Heading5"/>
     <w:uiPriority w:val="9"/>
     <w:semiHidden/>
-    <w:rsid w:val="00660C11"/>
+    <w:rsid w:val="00A20AA5"/>
     <w:rPr>
       <w:rFonts w:asciiTheme="minorHAnsi" w:eastAsiaTheme="majorEastAsia" w:hAnsiTheme="minorHAnsi" w:cstheme="majorBidi"/>
       <w:color w:val="0F4761" w:themeColor="accent1" w:themeShade="BF"/>
@@ -1171,7 +1171,7 @@
     <w:link w:val="Heading6"/>
     <w:uiPriority w:val="9"/>
     <w:semiHidden/>
-    <w:rsid w:val="00660C11"/>
+    <w:rsid w:val="00A20AA5"/>
     <w:rPr>
       <w:rFonts w:asciiTheme="minorHAnsi" w:eastAsiaTheme="majorEastAsia" w:hAnsiTheme="minorHAnsi" w:cstheme="majorBidi"/>
       <w:i/>
@@ -1185,7 +1185,7 @@
     <w:link w:val="Heading7"/>
     <w:uiPriority w:val="9"/>
     <w:semiHidden/>
-    <w:rsid w:val="00660C11"/>
+    <w:rsid w:val="00A20AA5"/>
     <w:rPr>
       <w:rFonts w:asciiTheme="minorHAnsi" w:eastAsiaTheme="majorEastAsia" w:hAnsiTheme="minorHAnsi" w:cstheme="majorBidi"/>
       <w:color w:val="595959" w:themeColor="text1" w:themeTint="A6"/>
@@ -1197,7 +1197,7 @@
     <w:link w:val="Heading8"/>
     <w:uiPriority w:val="9"/>
     <w:semiHidden/>
-    <w:rsid w:val="00660C11"/>
+    <w:rsid w:val="00A20AA5"/>
     <w:rPr>
       <w:rFonts w:asciiTheme="minorHAnsi" w:eastAsiaTheme="majorEastAsia" w:hAnsiTheme="minorHAnsi" w:cstheme="majorBidi"/>
       <w:i/>
@@ -1211,7 +1211,7 @@
     <w:link w:val="Heading9"/>
     <w:uiPriority w:val="9"/>
     <w:semiHidden/>
-    <w:rsid w:val="00660C11"/>
+    <w:rsid w:val="00A20AA5"/>
     <w:rPr>
       <w:rFonts w:asciiTheme="minorHAnsi" w:eastAsiaTheme="majorEastAsia" w:hAnsiTheme="minorHAnsi" w:cstheme="majorBidi"/>
       <w:color w:val="272727" w:themeColor="text1" w:themeTint="D8"/>
@@ -1224,7 +1224,7 @@
     <w:link w:val="TitleChar"/>
     <w:uiPriority w:val="10"/>
     <w:qFormat/>
-    <w:rsid w:val="00660C11"/>
+    <w:rsid w:val="00A20AA5"/>
     <w:pPr>
       <w:spacing w:after="80" w:line="240" w:lineRule="auto"/>
       <w:contextualSpacing/>
@@ -1242,7 +1242,7 @@
     <w:basedOn w:val="DefaultParagraphFont"/>
     <w:link w:val="Title"/>
     <w:uiPriority w:val="10"/>
-    <w:rsid w:val="00660C11"/>
+    <w:rsid w:val="00A20AA5"/>
     <w:rPr>
       <w:rFonts w:asciiTheme="majorHAnsi" w:eastAsiaTheme="majorEastAsia" w:hAnsiTheme="majorHAnsi" w:cstheme="majorBidi"/>
       <w:spacing w:val="-10"/>
@@ -1258,7 +1258,7 @@
     <w:link w:val="SubtitleChar"/>
     <w:uiPriority w:val="11"/>
     <w:qFormat/>
-    <w:rsid w:val="00660C11"/>
+    <w:rsid w:val="00A20AA5"/>
     <w:pPr>
       <w:numPr>
         <w:ilvl w:val="1"/>
@@ -1277,7 +1277,7 @@
     <w:basedOn w:val="DefaultParagraphFont"/>
     <w:link w:val="Subtitle"/>
     <w:uiPriority w:val="11"/>
-    <w:rsid w:val="00660C11"/>
+    <w:rsid w:val="00A20AA5"/>
     <w:rPr>
       <w:rFonts w:asciiTheme="minorHAnsi" w:eastAsiaTheme="majorEastAsia" w:hAnsiTheme="minorHAnsi" w:cstheme="majorBidi"/>
       <w:color w:val="595959" w:themeColor="text1" w:themeTint="A6"/>
@@ -1293,7 +1293,7 @@
     <w:link w:val="QuoteChar"/>
     <w:uiPriority w:val="29"/>
     <w:qFormat/>
-    <w:rsid w:val="00660C11"/>
+    <w:rsid w:val="00A20AA5"/>
     <w:pPr>
       <w:spacing w:before="160"/>
       <w:jc w:val="center"/>
@@ -1309,7 +1309,7 @@
     <w:basedOn w:val="DefaultParagraphFont"/>
     <w:link w:val="Quote"/>
     <w:uiPriority w:val="29"/>
-    <w:rsid w:val="00660C11"/>
+    <w:rsid w:val="00A20AA5"/>
     <w:rPr>
       <w:i/>
       <w:iCs/>
@@ -1321,7 +1321,7 @@
     <w:basedOn w:val="Normal"/>
     <w:uiPriority w:val="34"/>
     <w:qFormat/>
-    <w:rsid w:val="00660C11"/>
+    <w:rsid w:val="00A20AA5"/>
     <w:pPr>
       <w:ind w:left="720"/>
       <w:contextualSpacing/>
@@ -1332,7 +1332,7 @@
     <w:basedOn w:val="DefaultParagraphFont"/>
     <w:uiPriority w:val="21"/>
     <w:qFormat/>
-    <w:rsid w:val="00660C11"/>
+    <w:rsid w:val="00A20AA5"/>
     <w:rPr>
       <w:i/>
       <w:iCs/>
@@ -1346,7 +1346,7 @@
     <w:link w:val="IntenseQuoteChar"/>
     <w:uiPriority w:val="30"/>
     <w:qFormat/>
-    <w:rsid w:val="00660C11"/>
+    <w:rsid w:val="00A20AA5"/>
     <w:pPr>
       <w:pBdr>
         <w:top w:val="single" w:sz="4" w:space="10" w:color="0F4761" w:themeColor="accent1" w:themeShade="BF"/>
@@ -1367,7 +1367,7 @@
     <w:basedOn w:val="DefaultParagraphFont"/>
     <w:link w:val="IntenseQuote"/>
     <w:uiPriority w:val="30"/>
-    <w:rsid w:val="00660C11"/>
+    <w:rsid w:val="00A20AA5"/>
     <w:rPr>
       <w:i/>
       <w:iCs/>
@@ -1379,7 +1379,7 @@
     <w:basedOn w:val="DefaultParagraphFont"/>
     <w:uiPriority w:val="32"/>
     <w:qFormat/>
-    <w:rsid w:val="00660C11"/>
+    <w:rsid w:val="00A20AA5"/>
     <w:rPr>
       <w:b/>
       <w:bCs/>
@@ -1394,7 +1394,7 @@
     <w:link w:val="HeaderChar"/>
     <w:uiPriority w:val="99"/>
     <w:unhideWhenUsed/>
-    <w:rsid w:val="00660C11"/>
+    <w:rsid w:val="00A20AA5"/>
     <w:pPr>
       <w:tabs>
         <w:tab w:val="center" w:pos="4680"/>
@@ -1408,7 +1408,7 @@
     <w:basedOn w:val="DefaultParagraphFont"/>
     <w:link w:val="Header"/>
     <w:uiPriority w:val="99"/>
-    <w:rsid w:val="00660C11"/>
+    <w:rsid w:val="00A20AA5"/>
   </w:style>
   <w:style w:type="paragraph" w:styleId="Footer">
     <w:name w:val="footer"/>
@@ -1416,7 +1416,7 @@
     <w:link w:val="FooterChar"/>
     <w:uiPriority w:val="99"/>
     <w:unhideWhenUsed/>
-    <w:rsid w:val="00660C11"/>
+    <w:rsid w:val="00A20AA5"/>
     <w:pPr>
       <w:tabs>
         <w:tab w:val="center" w:pos="4680"/>
@@ -1430,7 +1430,7 @@
     <w:basedOn w:val="DefaultParagraphFont"/>
     <w:link w:val="Footer"/>
     <w:uiPriority w:val="99"/>
-    <w:rsid w:val="00660C11"/>
+    <w:rsid w:val="00A20AA5"/>
   </w:style>
 </w:styles>
 </file>

</xml_diff>

<commit_message>
fix: implement dynamic right-border touch positioning for TAB2 so Column 2 longest line touches right margin
</commit_message>
<xml_diff>
--- a/output/test_header_center.docx
+++ b/output/test_header_center.docx
@@ -21,8 +21,8 @@
     <w:p>
       <w:pPr>
         <w:tabs>
-          <w:tab w:val="center" w:pos="907"/>
-          <w:tab w:val="center" w:pos="5584"/>
+          <w:tab w:val="center" w:pos="1310"/>
+          <w:tab w:val="center" w:pos="5987"/>
         </w:tabs>
         <w:spacing w:before="60" w:after="60"/>
         <w:rPr>
@@ -50,10 +50,10 @@
     <w:p>
       <w:pPr>
         <w:tabs>
-          <w:tab w:val="left" w:pos="1814"/>
+          <w:tab w:val="left" w:pos="2619"/>
         </w:tabs>
         <w:spacing w:before="60" w:after="60"/>
-        <w:ind w:left="1814" w:hanging="1814"/>
+        <w:ind w:left="2619" w:hanging="2619"/>
         <w:rPr>
           <w:sz w:val="24"/>
         </w:rPr>
@@ -87,10 +87,10 @@
     <w:p>
       <w:pPr>
         <w:tabs>
-          <w:tab w:val="left" w:pos="1814"/>
+          <w:tab w:val="left" w:pos="2619"/>
         </w:tabs>
         <w:spacing w:before="60" w:after="60"/>
-        <w:ind w:left="1814" w:hanging="1814"/>
+        <w:ind w:left="2619" w:hanging="2619"/>
         <w:rPr>
           <w:sz w:val="24"/>
         </w:rPr>
@@ -124,10 +124,10 @@
     <w:p>
       <w:pPr>
         <w:tabs>
-          <w:tab w:val="left" w:pos="1814"/>
+          <w:tab w:val="left" w:pos="2619"/>
         </w:tabs>
         <w:spacing w:before="60" w:after="60"/>
-        <w:ind w:left="1814" w:hanging="1814"/>
+        <w:ind w:left="2619" w:hanging="2619"/>
         <w:rPr>
           <w:sz w:val="24"/>
         </w:rPr>
@@ -161,10 +161,10 @@
     <w:p>
       <w:pPr>
         <w:tabs>
-          <w:tab w:val="left" w:pos="1814"/>
+          <w:tab w:val="left" w:pos="2619"/>
         </w:tabs>
         <w:spacing w:before="60" w:after="60"/>
-        <w:ind w:left="1814" w:hanging="1814"/>
+        <w:ind w:left="2619" w:hanging="2619"/>
         <w:rPr>
           <w:sz w:val="24"/>
         </w:rPr>
@@ -198,10 +198,10 @@
     <w:p>
       <w:pPr>
         <w:tabs>
-          <w:tab w:val="left" w:pos="1814"/>
+          <w:tab w:val="left" w:pos="2619"/>
         </w:tabs>
         <w:spacing w:before="60" w:after="60"/>
-        <w:ind w:left="1814" w:hanging="1814"/>
+        <w:ind w:left="2619" w:hanging="2619"/>
         <w:rPr>
           <w:sz w:val="24"/>
         </w:rPr>
@@ -235,10 +235,10 @@
     <w:p>
       <w:pPr>
         <w:tabs>
-          <w:tab w:val="left" w:pos="1814"/>
+          <w:tab w:val="left" w:pos="2619"/>
         </w:tabs>
         <w:spacing w:before="60" w:after="60"/>
-        <w:ind w:left="1814" w:hanging="1814"/>
+        <w:ind w:left="2619" w:hanging="2619"/>
         <w:rPr>
           <w:sz w:val="24"/>
         </w:rPr>
@@ -879,7 +879,7 @@
     <w:link w:val="Heading1Char"/>
     <w:uiPriority w:val="9"/>
     <w:qFormat/>
-    <w:rsid w:val="00A20AA5"/>
+    <w:rsid w:val="00B16DB0"/>
     <w:pPr>
       <w:keepNext/>
       <w:keepLines/>
@@ -902,7 +902,7 @@
     <w:semiHidden/>
     <w:unhideWhenUsed/>
     <w:qFormat/>
-    <w:rsid w:val="00A20AA5"/>
+    <w:rsid w:val="00B16DB0"/>
     <w:pPr>
       <w:keepNext/>
       <w:keepLines/>
@@ -925,7 +925,7 @@
     <w:semiHidden/>
     <w:unhideWhenUsed/>
     <w:qFormat/>
-    <w:rsid w:val="00A20AA5"/>
+    <w:rsid w:val="00B16DB0"/>
     <w:pPr>
       <w:keepNext/>
       <w:keepLines/>
@@ -948,7 +948,7 @@
     <w:semiHidden/>
     <w:unhideWhenUsed/>
     <w:qFormat/>
-    <w:rsid w:val="00A20AA5"/>
+    <w:rsid w:val="00B16DB0"/>
     <w:pPr>
       <w:keepNext/>
       <w:keepLines/>
@@ -971,7 +971,7 @@
     <w:semiHidden/>
     <w:unhideWhenUsed/>
     <w:qFormat/>
-    <w:rsid w:val="00A20AA5"/>
+    <w:rsid w:val="00B16DB0"/>
     <w:pPr>
       <w:keepNext/>
       <w:keepLines/>
@@ -992,7 +992,7 @@
     <w:semiHidden/>
     <w:unhideWhenUsed/>
     <w:qFormat/>
-    <w:rsid w:val="00A20AA5"/>
+    <w:rsid w:val="00B16DB0"/>
     <w:pPr>
       <w:keepNext/>
       <w:keepLines/>
@@ -1015,7 +1015,7 @@
     <w:semiHidden/>
     <w:unhideWhenUsed/>
     <w:qFormat/>
-    <w:rsid w:val="00A20AA5"/>
+    <w:rsid w:val="00B16DB0"/>
     <w:pPr>
       <w:keepNext/>
       <w:keepLines/>
@@ -1036,7 +1036,7 @@
     <w:semiHidden/>
     <w:unhideWhenUsed/>
     <w:qFormat/>
-    <w:rsid w:val="00A20AA5"/>
+    <w:rsid w:val="00B16DB0"/>
     <w:pPr>
       <w:keepNext/>
       <w:keepLines/>
@@ -1059,7 +1059,7 @@
     <w:semiHidden/>
     <w:unhideWhenUsed/>
     <w:qFormat/>
-    <w:rsid w:val="00A20AA5"/>
+    <w:rsid w:val="00B16DB0"/>
     <w:pPr>
       <w:keepNext/>
       <w:keepLines/>
@@ -1103,7 +1103,7 @@
     <w:basedOn w:val="DefaultParagraphFont"/>
     <w:link w:val="Heading1"/>
     <w:uiPriority w:val="9"/>
-    <w:rsid w:val="00A20AA5"/>
+    <w:rsid w:val="00B16DB0"/>
     <w:rPr>
       <w:rFonts w:asciiTheme="majorHAnsi" w:eastAsiaTheme="majorEastAsia" w:hAnsiTheme="majorHAnsi" w:cstheme="majorBidi"/>
       <w:color w:val="0F4761" w:themeColor="accent1" w:themeShade="BF"/>
@@ -1117,7 +1117,7 @@
     <w:link w:val="Heading2"/>
     <w:uiPriority w:val="9"/>
     <w:semiHidden/>
-    <w:rsid w:val="00A20AA5"/>
+    <w:rsid w:val="00B16DB0"/>
     <w:rPr>
       <w:rFonts w:asciiTheme="majorHAnsi" w:eastAsiaTheme="majorEastAsia" w:hAnsiTheme="majorHAnsi" w:cstheme="majorBidi"/>
       <w:color w:val="0F4761" w:themeColor="accent1" w:themeShade="BF"/>
@@ -1131,7 +1131,7 @@
     <w:link w:val="Heading3"/>
     <w:uiPriority w:val="9"/>
     <w:semiHidden/>
-    <w:rsid w:val="00A20AA5"/>
+    <w:rsid w:val="00B16DB0"/>
     <w:rPr>
       <w:rFonts w:asciiTheme="minorHAnsi" w:eastAsiaTheme="majorEastAsia" w:hAnsiTheme="minorHAnsi" w:cstheme="majorBidi"/>
       <w:color w:val="0F4761" w:themeColor="accent1" w:themeShade="BF"/>
@@ -1145,7 +1145,7 @@
     <w:link w:val="Heading4"/>
     <w:uiPriority w:val="9"/>
     <w:semiHidden/>
-    <w:rsid w:val="00A20AA5"/>
+    <w:rsid w:val="00B16DB0"/>
     <w:rPr>
       <w:rFonts w:asciiTheme="minorHAnsi" w:eastAsiaTheme="majorEastAsia" w:hAnsiTheme="minorHAnsi" w:cstheme="majorBidi"/>
       <w:i/>
@@ -1159,7 +1159,7 @@
     <w:link w:val="Heading5"/>
     <w:uiPriority w:val="9"/>
     <w:semiHidden/>
-    <w:rsid w:val="00A20AA5"/>
+    <w:rsid w:val="00B16DB0"/>
     <w:rPr>
       <w:rFonts w:asciiTheme="minorHAnsi" w:eastAsiaTheme="majorEastAsia" w:hAnsiTheme="minorHAnsi" w:cstheme="majorBidi"/>
       <w:color w:val="0F4761" w:themeColor="accent1" w:themeShade="BF"/>
@@ -1171,7 +1171,7 @@
     <w:link w:val="Heading6"/>
     <w:uiPriority w:val="9"/>
     <w:semiHidden/>
-    <w:rsid w:val="00A20AA5"/>
+    <w:rsid w:val="00B16DB0"/>
     <w:rPr>
       <w:rFonts w:asciiTheme="minorHAnsi" w:eastAsiaTheme="majorEastAsia" w:hAnsiTheme="minorHAnsi" w:cstheme="majorBidi"/>
       <w:i/>
@@ -1185,7 +1185,7 @@
     <w:link w:val="Heading7"/>
     <w:uiPriority w:val="9"/>
     <w:semiHidden/>
-    <w:rsid w:val="00A20AA5"/>
+    <w:rsid w:val="00B16DB0"/>
     <w:rPr>
       <w:rFonts w:asciiTheme="minorHAnsi" w:eastAsiaTheme="majorEastAsia" w:hAnsiTheme="minorHAnsi" w:cstheme="majorBidi"/>
       <w:color w:val="595959" w:themeColor="text1" w:themeTint="A6"/>
@@ -1197,7 +1197,7 @@
     <w:link w:val="Heading8"/>
     <w:uiPriority w:val="9"/>
     <w:semiHidden/>
-    <w:rsid w:val="00A20AA5"/>
+    <w:rsid w:val="00B16DB0"/>
     <w:rPr>
       <w:rFonts w:asciiTheme="minorHAnsi" w:eastAsiaTheme="majorEastAsia" w:hAnsiTheme="minorHAnsi" w:cstheme="majorBidi"/>
       <w:i/>
@@ -1211,7 +1211,7 @@
     <w:link w:val="Heading9"/>
     <w:uiPriority w:val="9"/>
     <w:semiHidden/>
-    <w:rsid w:val="00A20AA5"/>
+    <w:rsid w:val="00B16DB0"/>
     <w:rPr>
       <w:rFonts w:asciiTheme="minorHAnsi" w:eastAsiaTheme="majorEastAsia" w:hAnsiTheme="minorHAnsi" w:cstheme="majorBidi"/>
       <w:color w:val="272727" w:themeColor="text1" w:themeTint="D8"/>
@@ -1224,7 +1224,7 @@
     <w:link w:val="TitleChar"/>
     <w:uiPriority w:val="10"/>
     <w:qFormat/>
-    <w:rsid w:val="00A20AA5"/>
+    <w:rsid w:val="00B16DB0"/>
     <w:pPr>
       <w:spacing w:after="80" w:line="240" w:lineRule="auto"/>
       <w:contextualSpacing/>
@@ -1242,7 +1242,7 @@
     <w:basedOn w:val="DefaultParagraphFont"/>
     <w:link w:val="Title"/>
     <w:uiPriority w:val="10"/>
-    <w:rsid w:val="00A20AA5"/>
+    <w:rsid w:val="00B16DB0"/>
     <w:rPr>
       <w:rFonts w:asciiTheme="majorHAnsi" w:eastAsiaTheme="majorEastAsia" w:hAnsiTheme="majorHAnsi" w:cstheme="majorBidi"/>
       <w:spacing w:val="-10"/>
@@ -1258,7 +1258,7 @@
     <w:link w:val="SubtitleChar"/>
     <w:uiPriority w:val="11"/>
     <w:qFormat/>
-    <w:rsid w:val="00A20AA5"/>
+    <w:rsid w:val="00B16DB0"/>
     <w:pPr>
       <w:numPr>
         <w:ilvl w:val="1"/>
@@ -1277,7 +1277,7 @@
     <w:basedOn w:val="DefaultParagraphFont"/>
     <w:link w:val="Subtitle"/>
     <w:uiPriority w:val="11"/>
-    <w:rsid w:val="00A20AA5"/>
+    <w:rsid w:val="00B16DB0"/>
     <w:rPr>
       <w:rFonts w:asciiTheme="minorHAnsi" w:eastAsiaTheme="majorEastAsia" w:hAnsiTheme="minorHAnsi" w:cstheme="majorBidi"/>
       <w:color w:val="595959" w:themeColor="text1" w:themeTint="A6"/>
@@ -1293,7 +1293,7 @@
     <w:link w:val="QuoteChar"/>
     <w:uiPriority w:val="29"/>
     <w:qFormat/>
-    <w:rsid w:val="00A20AA5"/>
+    <w:rsid w:val="00B16DB0"/>
     <w:pPr>
       <w:spacing w:before="160"/>
       <w:jc w:val="center"/>
@@ -1309,7 +1309,7 @@
     <w:basedOn w:val="DefaultParagraphFont"/>
     <w:link w:val="Quote"/>
     <w:uiPriority w:val="29"/>
-    <w:rsid w:val="00A20AA5"/>
+    <w:rsid w:val="00B16DB0"/>
     <w:rPr>
       <w:i/>
       <w:iCs/>
@@ -1321,7 +1321,7 @@
     <w:basedOn w:val="Normal"/>
     <w:uiPriority w:val="34"/>
     <w:qFormat/>
-    <w:rsid w:val="00A20AA5"/>
+    <w:rsid w:val="00B16DB0"/>
     <w:pPr>
       <w:ind w:left="720"/>
       <w:contextualSpacing/>
@@ -1332,7 +1332,7 @@
     <w:basedOn w:val="DefaultParagraphFont"/>
     <w:uiPriority w:val="21"/>
     <w:qFormat/>
-    <w:rsid w:val="00A20AA5"/>
+    <w:rsid w:val="00B16DB0"/>
     <w:rPr>
       <w:i/>
       <w:iCs/>
@@ -1346,7 +1346,7 @@
     <w:link w:val="IntenseQuoteChar"/>
     <w:uiPriority w:val="30"/>
     <w:qFormat/>
-    <w:rsid w:val="00A20AA5"/>
+    <w:rsid w:val="00B16DB0"/>
     <w:pPr>
       <w:pBdr>
         <w:top w:val="single" w:sz="4" w:space="10" w:color="0F4761" w:themeColor="accent1" w:themeShade="BF"/>
@@ -1367,7 +1367,7 @@
     <w:basedOn w:val="DefaultParagraphFont"/>
     <w:link w:val="IntenseQuote"/>
     <w:uiPriority w:val="30"/>
-    <w:rsid w:val="00A20AA5"/>
+    <w:rsid w:val="00B16DB0"/>
     <w:rPr>
       <w:i/>
       <w:iCs/>
@@ -1379,7 +1379,7 @@
     <w:basedOn w:val="DefaultParagraphFont"/>
     <w:uiPriority w:val="32"/>
     <w:qFormat/>
-    <w:rsid w:val="00A20AA5"/>
+    <w:rsid w:val="00B16DB0"/>
     <w:rPr>
       <w:b/>
       <w:bCs/>
@@ -1394,7 +1394,7 @@
     <w:link w:val="HeaderChar"/>
     <w:uiPriority w:val="99"/>
     <w:unhideWhenUsed/>
-    <w:rsid w:val="00A20AA5"/>
+    <w:rsid w:val="00B16DB0"/>
     <w:pPr>
       <w:tabs>
         <w:tab w:val="center" w:pos="4680"/>
@@ -1408,7 +1408,7 @@
     <w:basedOn w:val="DefaultParagraphFont"/>
     <w:link w:val="Header"/>
     <w:uiPriority w:val="99"/>
-    <w:rsid w:val="00A20AA5"/>
+    <w:rsid w:val="00B16DB0"/>
   </w:style>
   <w:style w:type="paragraph" w:styleId="Footer">
     <w:name w:val="footer"/>
@@ -1416,7 +1416,7 @@
     <w:link w:val="FooterChar"/>
     <w:uiPriority w:val="99"/>
     <w:unhideWhenUsed/>
-    <w:rsid w:val="00A20AA5"/>
+    <w:rsid w:val="00B16DB0"/>
     <w:pPr>
       <w:tabs>
         <w:tab w:val="center" w:pos="4680"/>
@@ -1430,7 +1430,7 @@
     <w:basedOn w:val="DefaultParagraphFont"/>
     <w:link w:val="Footer"/>
     <w:uiPriority w:val="99"/>
-    <w:rsid w:val="00A20AA5"/>
+    <w:rsid w:val="00B16DB0"/>
   </w:style>
 </w:styles>
 </file>

</xml_diff>

<commit_message>
fix: adjust TAB2 width calculation with 0.6cm safety buffer to guarantee zero single-word line wrapping
</commit_message>
<xml_diff>
--- a/output/test_header_center.docx
+++ b/output/test_header_center.docx
@@ -21,8 +21,8 @@
     <w:p>
       <w:pPr>
         <w:tabs>
-          <w:tab w:val="center" w:pos="1310"/>
-          <w:tab w:val="center" w:pos="5987"/>
+          <w:tab w:val="center" w:pos="986"/>
+          <w:tab w:val="center" w:pos="5664"/>
         </w:tabs>
         <w:spacing w:before="60" w:after="60"/>
         <w:rPr>
@@ -50,10 +50,10 @@
     <w:p>
       <w:pPr>
         <w:tabs>
-          <w:tab w:val="left" w:pos="2619"/>
+          <w:tab w:val="left" w:pos="1973"/>
         </w:tabs>
         <w:spacing w:before="60" w:after="60"/>
-        <w:ind w:left="2619" w:hanging="2619"/>
+        <w:ind w:left="1973" w:hanging="1973"/>
         <w:rPr>
           <w:sz w:val="24"/>
         </w:rPr>
@@ -87,10 +87,10 @@
     <w:p>
       <w:pPr>
         <w:tabs>
-          <w:tab w:val="left" w:pos="2619"/>
+          <w:tab w:val="left" w:pos="1973"/>
         </w:tabs>
         <w:spacing w:before="60" w:after="60"/>
-        <w:ind w:left="2619" w:hanging="2619"/>
+        <w:ind w:left="1973" w:hanging="1973"/>
         <w:rPr>
           <w:sz w:val="24"/>
         </w:rPr>
@@ -124,10 +124,10 @@
     <w:p>
       <w:pPr>
         <w:tabs>
-          <w:tab w:val="left" w:pos="2619"/>
+          <w:tab w:val="left" w:pos="1973"/>
         </w:tabs>
         <w:spacing w:before="60" w:after="60"/>
-        <w:ind w:left="2619" w:hanging="2619"/>
+        <w:ind w:left="1973" w:hanging="1973"/>
         <w:rPr>
           <w:sz w:val="24"/>
         </w:rPr>
@@ -161,10 +161,10 @@
     <w:p>
       <w:pPr>
         <w:tabs>
-          <w:tab w:val="left" w:pos="2619"/>
+          <w:tab w:val="left" w:pos="1973"/>
         </w:tabs>
         <w:spacing w:before="60" w:after="60"/>
-        <w:ind w:left="2619" w:hanging="2619"/>
+        <w:ind w:left="1973" w:hanging="1973"/>
         <w:rPr>
           <w:sz w:val="24"/>
         </w:rPr>
@@ -198,10 +198,10 @@
     <w:p>
       <w:pPr>
         <w:tabs>
-          <w:tab w:val="left" w:pos="2619"/>
+          <w:tab w:val="left" w:pos="1973"/>
         </w:tabs>
         <w:spacing w:before="60" w:after="60"/>
-        <w:ind w:left="2619" w:hanging="2619"/>
+        <w:ind w:left="1973" w:hanging="1973"/>
         <w:rPr>
           <w:sz w:val="24"/>
         </w:rPr>
@@ -235,10 +235,10 @@
     <w:p>
       <w:pPr>
         <w:tabs>
-          <w:tab w:val="left" w:pos="2619"/>
+          <w:tab w:val="left" w:pos="1973"/>
         </w:tabs>
         <w:spacing w:before="60" w:after="60"/>
-        <w:ind w:left="2619" w:hanging="2619"/>
+        <w:ind w:left="1973" w:hanging="1973"/>
         <w:rPr>
           <w:sz w:val="24"/>
         </w:rPr>
@@ -879,7 +879,7 @@
     <w:link w:val="Heading1Char"/>
     <w:uiPriority w:val="9"/>
     <w:qFormat/>
-    <w:rsid w:val="00B16DB0"/>
+    <w:rsid w:val="00B41762"/>
     <w:pPr>
       <w:keepNext/>
       <w:keepLines/>
@@ -902,7 +902,7 @@
     <w:semiHidden/>
     <w:unhideWhenUsed/>
     <w:qFormat/>
-    <w:rsid w:val="00B16DB0"/>
+    <w:rsid w:val="00B41762"/>
     <w:pPr>
       <w:keepNext/>
       <w:keepLines/>
@@ -925,7 +925,7 @@
     <w:semiHidden/>
     <w:unhideWhenUsed/>
     <w:qFormat/>
-    <w:rsid w:val="00B16DB0"/>
+    <w:rsid w:val="00B41762"/>
     <w:pPr>
       <w:keepNext/>
       <w:keepLines/>
@@ -948,7 +948,7 @@
     <w:semiHidden/>
     <w:unhideWhenUsed/>
     <w:qFormat/>
-    <w:rsid w:val="00B16DB0"/>
+    <w:rsid w:val="00B41762"/>
     <w:pPr>
       <w:keepNext/>
       <w:keepLines/>
@@ -971,7 +971,7 @@
     <w:semiHidden/>
     <w:unhideWhenUsed/>
     <w:qFormat/>
-    <w:rsid w:val="00B16DB0"/>
+    <w:rsid w:val="00B41762"/>
     <w:pPr>
       <w:keepNext/>
       <w:keepLines/>
@@ -992,7 +992,7 @@
     <w:semiHidden/>
     <w:unhideWhenUsed/>
     <w:qFormat/>
-    <w:rsid w:val="00B16DB0"/>
+    <w:rsid w:val="00B41762"/>
     <w:pPr>
       <w:keepNext/>
       <w:keepLines/>
@@ -1015,7 +1015,7 @@
     <w:semiHidden/>
     <w:unhideWhenUsed/>
     <w:qFormat/>
-    <w:rsid w:val="00B16DB0"/>
+    <w:rsid w:val="00B41762"/>
     <w:pPr>
       <w:keepNext/>
       <w:keepLines/>
@@ -1036,7 +1036,7 @@
     <w:semiHidden/>
     <w:unhideWhenUsed/>
     <w:qFormat/>
-    <w:rsid w:val="00B16DB0"/>
+    <w:rsid w:val="00B41762"/>
     <w:pPr>
       <w:keepNext/>
       <w:keepLines/>
@@ -1059,7 +1059,7 @@
     <w:semiHidden/>
     <w:unhideWhenUsed/>
     <w:qFormat/>
-    <w:rsid w:val="00B16DB0"/>
+    <w:rsid w:val="00B41762"/>
     <w:pPr>
       <w:keepNext/>
       <w:keepLines/>
@@ -1103,7 +1103,7 @@
     <w:basedOn w:val="DefaultParagraphFont"/>
     <w:link w:val="Heading1"/>
     <w:uiPriority w:val="9"/>
-    <w:rsid w:val="00B16DB0"/>
+    <w:rsid w:val="00B41762"/>
     <w:rPr>
       <w:rFonts w:asciiTheme="majorHAnsi" w:eastAsiaTheme="majorEastAsia" w:hAnsiTheme="majorHAnsi" w:cstheme="majorBidi"/>
       <w:color w:val="0F4761" w:themeColor="accent1" w:themeShade="BF"/>
@@ -1117,7 +1117,7 @@
     <w:link w:val="Heading2"/>
     <w:uiPriority w:val="9"/>
     <w:semiHidden/>
-    <w:rsid w:val="00B16DB0"/>
+    <w:rsid w:val="00B41762"/>
     <w:rPr>
       <w:rFonts w:asciiTheme="majorHAnsi" w:eastAsiaTheme="majorEastAsia" w:hAnsiTheme="majorHAnsi" w:cstheme="majorBidi"/>
       <w:color w:val="0F4761" w:themeColor="accent1" w:themeShade="BF"/>
@@ -1131,7 +1131,7 @@
     <w:link w:val="Heading3"/>
     <w:uiPriority w:val="9"/>
     <w:semiHidden/>
-    <w:rsid w:val="00B16DB0"/>
+    <w:rsid w:val="00B41762"/>
     <w:rPr>
       <w:rFonts w:asciiTheme="minorHAnsi" w:eastAsiaTheme="majorEastAsia" w:hAnsiTheme="minorHAnsi" w:cstheme="majorBidi"/>
       <w:color w:val="0F4761" w:themeColor="accent1" w:themeShade="BF"/>
@@ -1145,7 +1145,7 @@
     <w:link w:val="Heading4"/>
     <w:uiPriority w:val="9"/>
     <w:semiHidden/>
-    <w:rsid w:val="00B16DB0"/>
+    <w:rsid w:val="00B41762"/>
     <w:rPr>
       <w:rFonts w:asciiTheme="minorHAnsi" w:eastAsiaTheme="majorEastAsia" w:hAnsiTheme="minorHAnsi" w:cstheme="majorBidi"/>
       <w:i/>
@@ -1159,7 +1159,7 @@
     <w:link w:val="Heading5"/>
     <w:uiPriority w:val="9"/>
     <w:semiHidden/>
-    <w:rsid w:val="00B16DB0"/>
+    <w:rsid w:val="00B41762"/>
     <w:rPr>
       <w:rFonts w:asciiTheme="minorHAnsi" w:eastAsiaTheme="majorEastAsia" w:hAnsiTheme="minorHAnsi" w:cstheme="majorBidi"/>
       <w:color w:val="0F4761" w:themeColor="accent1" w:themeShade="BF"/>
@@ -1171,7 +1171,7 @@
     <w:link w:val="Heading6"/>
     <w:uiPriority w:val="9"/>
     <w:semiHidden/>
-    <w:rsid w:val="00B16DB0"/>
+    <w:rsid w:val="00B41762"/>
     <w:rPr>
       <w:rFonts w:asciiTheme="minorHAnsi" w:eastAsiaTheme="majorEastAsia" w:hAnsiTheme="minorHAnsi" w:cstheme="majorBidi"/>
       <w:i/>
@@ -1185,7 +1185,7 @@
     <w:link w:val="Heading7"/>
     <w:uiPriority w:val="9"/>
     <w:semiHidden/>
-    <w:rsid w:val="00B16DB0"/>
+    <w:rsid w:val="00B41762"/>
     <w:rPr>
       <w:rFonts w:asciiTheme="minorHAnsi" w:eastAsiaTheme="majorEastAsia" w:hAnsiTheme="minorHAnsi" w:cstheme="majorBidi"/>
       <w:color w:val="595959" w:themeColor="text1" w:themeTint="A6"/>
@@ -1197,7 +1197,7 @@
     <w:link w:val="Heading8"/>
     <w:uiPriority w:val="9"/>
     <w:semiHidden/>
-    <w:rsid w:val="00B16DB0"/>
+    <w:rsid w:val="00B41762"/>
     <w:rPr>
       <w:rFonts w:asciiTheme="minorHAnsi" w:eastAsiaTheme="majorEastAsia" w:hAnsiTheme="minorHAnsi" w:cstheme="majorBidi"/>
       <w:i/>
@@ -1211,7 +1211,7 @@
     <w:link w:val="Heading9"/>
     <w:uiPriority w:val="9"/>
     <w:semiHidden/>
-    <w:rsid w:val="00B16DB0"/>
+    <w:rsid w:val="00B41762"/>
     <w:rPr>
       <w:rFonts w:asciiTheme="minorHAnsi" w:eastAsiaTheme="majorEastAsia" w:hAnsiTheme="minorHAnsi" w:cstheme="majorBidi"/>
       <w:color w:val="272727" w:themeColor="text1" w:themeTint="D8"/>
@@ -1224,7 +1224,7 @@
     <w:link w:val="TitleChar"/>
     <w:uiPriority w:val="10"/>
     <w:qFormat/>
-    <w:rsid w:val="00B16DB0"/>
+    <w:rsid w:val="00B41762"/>
     <w:pPr>
       <w:spacing w:after="80" w:line="240" w:lineRule="auto"/>
       <w:contextualSpacing/>
@@ -1242,7 +1242,7 @@
     <w:basedOn w:val="DefaultParagraphFont"/>
     <w:link w:val="Title"/>
     <w:uiPriority w:val="10"/>
-    <w:rsid w:val="00B16DB0"/>
+    <w:rsid w:val="00B41762"/>
     <w:rPr>
       <w:rFonts w:asciiTheme="majorHAnsi" w:eastAsiaTheme="majorEastAsia" w:hAnsiTheme="majorHAnsi" w:cstheme="majorBidi"/>
       <w:spacing w:val="-10"/>
@@ -1258,7 +1258,7 @@
     <w:link w:val="SubtitleChar"/>
     <w:uiPriority w:val="11"/>
     <w:qFormat/>
-    <w:rsid w:val="00B16DB0"/>
+    <w:rsid w:val="00B41762"/>
     <w:pPr>
       <w:numPr>
         <w:ilvl w:val="1"/>
@@ -1277,7 +1277,7 @@
     <w:basedOn w:val="DefaultParagraphFont"/>
     <w:link w:val="Subtitle"/>
     <w:uiPriority w:val="11"/>
-    <w:rsid w:val="00B16DB0"/>
+    <w:rsid w:val="00B41762"/>
     <w:rPr>
       <w:rFonts w:asciiTheme="minorHAnsi" w:eastAsiaTheme="majorEastAsia" w:hAnsiTheme="minorHAnsi" w:cstheme="majorBidi"/>
       <w:color w:val="595959" w:themeColor="text1" w:themeTint="A6"/>
@@ -1293,7 +1293,7 @@
     <w:link w:val="QuoteChar"/>
     <w:uiPriority w:val="29"/>
     <w:qFormat/>
-    <w:rsid w:val="00B16DB0"/>
+    <w:rsid w:val="00B41762"/>
     <w:pPr>
       <w:spacing w:before="160"/>
       <w:jc w:val="center"/>
@@ -1309,7 +1309,7 @@
     <w:basedOn w:val="DefaultParagraphFont"/>
     <w:link w:val="Quote"/>
     <w:uiPriority w:val="29"/>
-    <w:rsid w:val="00B16DB0"/>
+    <w:rsid w:val="00B41762"/>
     <w:rPr>
       <w:i/>
       <w:iCs/>
@@ -1321,7 +1321,7 @@
     <w:basedOn w:val="Normal"/>
     <w:uiPriority w:val="34"/>
     <w:qFormat/>
-    <w:rsid w:val="00B16DB0"/>
+    <w:rsid w:val="00B41762"/>
     <w:pPr>
       <w:ind w:left="720"/>
       <w:contextualSpacing/>
@@ -1332,7 +1332,7 @@
     <w:basedOn w:val="DefaultParagraphFont"/>
     <w:uiPriority w:val="21"/>
     <w:qFormat/>
-    <w:rsid w:val="00B16DB0"/>
+    <w:rsid w:val="00B41762"/>
     <w:rPr>
       <w:i/>
       <w:iCs/>
@@ -1346,7 +1346,7 @@
     <w:link w:val="IntenseQuoteChar"/>
     <w:uiPriority w:val="30"/>
     <w:qFormat/>
-    <w:rsid w:val="00B16DB0"/>
+    <w:rsid w:val="00B41762"/>
     <w:pPr>
       <w:pBdr>
         <w:top w:val="single" w:sz="4" w:space="10" w:color="0F4761" w:themeColor="accent1" w:themeShade="BF"/>
@@ -1367,7 +1367,7 @@
     <w:basedOn w:val="DefaultParagraphFont"/>
     <w:link w:val="IntenseQuote"/>
     <w:uiPriority w:val="30"/>
-    <w:rsid w:val="00B16DB0"/>
+    <w:rsid w:val="00B41762"/>
     <w:rPr>
       <w:i/>
       <w:iCs/>
@@ -1379,7 +1379,7 @@
     <w:basedOn w:val="DefaultParagraphFont"/>
     <w:uiPriority w:val="32"/>
     <w:qFormat/>
-    <w:rsid w:val="00B16DB0"/>
+    <w:rsid w:val="00B41762"/>
     <w:rPr>
       <w:b/>
       <w:bCs/>
@@ -1394,7 +1394,7 @@
     <w:link w:val="HeaderChar"/>
     <w:uiPriority w:val="99"/>
     <w:unhideWhenUsed/>
-    <w:rsid w:val="00B16DB0"/>
+    <w:rsid w:val="00B41762"/>
     <w:pPr>
       <w:tabs>
         <w:tab w:val="center" w:pos="4680"/>
@@ -1408,7 +1408,7 @@
     <w:basedOn w:val="DefaultParagraphFont"/>
     <w:link w:val="Header"/>
     <w:uiPriority w:val="99"/>
-    <w:rsid w:val="00B16DB0"/>
+    <w:rsid w:val="00B41762"/>
   </w:style>
   <w:style w:type="paragraph" w:styleId="Footer">
     <w:name w:val="footer"/>
@@ -1416,7 +1416,7 @@
     <w:link w:val="FooterChar"/>
     <w:uiPriority w:val="99"/>
     <w:unhideWhenUsed/>
-    <w:rsid w:val="00B16DB0"/>
+    <w:rsid w:val="00B41762"/>
     <w:pPr>
       <w:tabs>
         <w:tab w:val="center" w:pos="4680"/>
@@ -1430,7 +1430,7 @@
     <w:basedOn w:val="DefaultParagraphFont"/>
     <w:link w:val="Footer"/>
     <w:uiPriority w:val="99"/>
-    <w:rsid w:val="00B16DB0"/>
+    <w:rsid w:val="00B41762"/>
   </w:style>
 </w:styles>
 </file>

</xml_diff>